<commit_message>
Update CV: publication venues, MMAT courses, and CV PDF link
</commit_message>
<xml_diff>
--- a/cv.docx
+++ b/cv.docx
@@ -138,29 +138,7 @@
                                   <w:szCs w:val="18"/>
                                   <w:lang w:bidi="zh-CN"/>
                                 </w:rPr>
-                                <w:t>https://hhj</w:t>
-                              </w:r>
-                              <w:r>
-                                <w:rPr>
-                                  <w:rStyle w:val="af0"/>
-                                  <w:b/>
-                                  <w:bCs/>
-                                  <w:sz w:val="18"/>
-                                  <w:szCs w:val="18"/>
-                                  <w:lang w:bidi="zh-CN"/>
-                                </w:rPr>
-                                <w:t>c</w:t>
-                              </w:r>
-                              <w:r>
-                                <w:rPr>
-                                  <w:rStyle w:val="af0"/>
-                                  <w:b/>
-                                  <w:bCs/>
-                                  <w:sz w:val="18"/>
-                                  <w:szCs w:val="18"/>
-                                  <w:lang w:bidi="zh-CN"/>
-                                </w:rPr>
-                                <w:t>-web.github.io/</w:t>
+                                <w:t>https://hhjc-web.github.io/</w:t>
                               </w:r>
                             </w:hyperlink>
                           </w:p>
@@ -211,29 +189,7 @@
                                   <w:szCs w:val="18"/>
                                   <w:lang w:bidi="zh-CN"/>
                                 </w:rPr>
-                                <w:t>https://scholar.google.com/citations?user=D7NWc1</w:t>
-                              </w:r>
-                              <w:r>
-                                <w:rPr>
-                                  <w:rStyle w:val="af0"/>
-                                  <w:b/>
-                                  <w:bCs/>
-                                  <w:sz w:val="18"/>
-                                  <w:szCs w:val="18"/>
-                                  <w:lang w:bidi="zh-CN"/>
-                                </w:rPr>
-                                <w:t>Q</w:t>
-                              </w:r>
-                              <w:r>
-                                <w:rPr>
-                                  <w:rStyle w:val="af0"/>
-                                  <w:b/>
-                                  <w:bCs/>
-                                  <w:sz w:val="18"/>
-                                  <w:szCs w:val="18"/>
-                                  <w:lang w:bidi="zh-CN"/>
-                                </w:rPr>
-                                <w:t>AAAAJ&amp;</w:t>
+                                <w:t>https://scholar.google.com/citations?user=D7NWc1QAAAAJ&amp;</w:t>
                               </w:r>
                             </w:hyperlink>
                           </w:p>
@@ -421,29 +377,7 @@
                             <w:szCs w:val="18"/>
                             <w:lang w:bidi="zh-CN"/>
                           </w:rPr>
-                          <w:t>https://hhj</w:t>
-                        </w:r>
-                        <w:r>
-                          <w:rPr>
-                            <w:rStyle w:val="af0"/>
-                            <w:b/>
-                            <w:bCs/>
-                            <w:sz w:val="18"/>
-                            <w:szCs w:val="18"/>
-                            <w:lang w:bidi="zh-CN"/>
-                          </w:rPr>
-                          <w:t>c</w:t>
-                        </w:r>
-                        <w:r>
-                          <w:rPr>
-                            <w:rStyle w:val="af0"/>
-                            <w:b/>
-                            <w:bCs/>
-                            <w:sz w:val="18"/>
-                            <w:szCs w:val="18"/>
-                            <w:lang w:bidi="zh-CN"/>
-                          </w:rPr>
-                          <w:t>-web.github.io/</w:t>
+                          <w:t>https://hhjc-web.github.io/</w:t>
                         </w:r>
                       </w:hyperlink>
                     </w:p>
@@ -494,29 +428,7 @@
                             <w:szCs w:val="18"/>
                             <w:lang w:bidi="zh-CN"/>
                           </w:rPr>
-                          <w:t>https://scholar.google.com/citations?user=D7NWc1</w:t>
-                        </w:r>
-                        <w:r>
-                          <w:rPr>
-                            <w:rStyle w:val="af0"/>
-                            <w:b/>
-                            <w:bCs/>
-                            <w:sz w:val="18"/>
-                            <w:szCs w:val="18"/>
-                            <w:lang w:bidi="zh-CN"/>
-                          </w:rPr>
-                          <w:t>Q</w:t>
-                        </w:r>
-                        <w:r>
-                          <w:rPr>
-                            <w:rStyle w:val="af0"/>
-                            <w:b/>
-                            <w:bCs/>
-                            <w:sz w:val="18"/>
-                            <w:szCs w:val="18"/>
-                            <w:lang w:bidi="zh-CN"/>
-                          </w:rPr>
-                          <w:t>AAAAJ&amp;</w:t>
+                          <w:t>https://scholar.google.com/citations?user=D7NWc1QAAAAJ&amp;</w:t>
                         </w:r>
                       </w:hyperlink>
                     </w:p>
@@ -2366,29 +2278,16 @@
         </w:rPr>
         <w:t xml:space="preserve"> B. Jin, and Z. Zhou, </w:t>
       </w:r>
-      <w:proofErr w:type="gramStart"/>
-      <w:r>
-        <w:rPr>
-          <w:rFonts w:hint="eastAsia"/>
-          <w:caps w:val="0"/>
-          <w:spacing w:val="-6"/>
-          <w:sz w:val="20"/>
-          <w:szCs w:val="20"/>
-          <w:lang w:eastAsia="zh-CN" w:bidi="zh-CN"/>
-        </w:rPr>
-        <w:t>Point</w:t>
-      </w:r>
-      <w:proofErr w:type="gramEnd"/>
-      <w:r>
-        <w:rPr>
-          <w:rFonts w:hint="eastAsia"/>
-          <w:caps w:val="0"/>
-          <w:spacing w:val="-6"/>
-          <w:sz w:val="20"/>
-          <w:szCs w:val="20"/>
-          <w:lang w:eastAsia="zh-CN" w:bidi="zh-CN"/>
-        </w:rPr>
-        <w:t xml:space="preserve"> </w:t>
+      <w:r>
+        <w:rPr>
+          <w:rFonts w:hint="eastAsia"/>
+          <w:caps w:val="0"/>
+          <w:spacing w:val="-6"/>
+          <w:sz w:val="20"/>
+          <w:szCs w:val="20"/>
+          <w:lang w:eastAsia="zh-CN" w:bidi="zh-CN"/>
+        </w:rPr>
+        <w:t xml:space="preserve">Point </w:t>
       </w:r>
       <w:r>
         <w:rPr>
@@ -3045,11 +2944,12 @@
       </w:r>
       <w:r>
         <w:rPr>
-          <w:sz w:val="20"/>
-          <w:szCs w:val="20"/>
-          <w:lang w:bidi="zh-CN"/>
-        </w:rPr>
-        <w:t>.</w:t>
+          <w:rFonts w:hint="eastAsia"/>
+          <w:sz w:val="20"/>
+          <w:szCs w:val="20"/>
+          <w:lang w:eastAsia="zh-CN" w:bidi="zh-CN"/>
+        </w:rPr>
+        <w:t>,</w:t>
       </w:r>
       <w:r>
         <w:rPr>
@@ -3094,14 +2994,13 @@
       </w:r>
       <w:r>
         <w:rPr>
-          <w:rFonts w:hint="eastAsia"/>
-          <w:caps w:val="0"/>
-          <w:spacing w:val="-6"/>
-          <w:sz w:val="20"/>
-          <w:szCs w:val="20"/>
-          <w:lang w:eastAsia="zh-CN" w:bidi="zh-CN"/>
-        </w:rPr>
-        <w:t>Journal of Computational Physics</w:t>
+          <w:caps w:val="0"/>
+          <w:spacing w:val="-6"/>
+          <w:sz w:val="20"/>
+          <w:szCs w:val="20"/>
+          <w:lang w:eastAsia="zh-CN" w:bidi="zh-CN"/>
+        </w:rPr>
+        <w:t>ESAIM: Mathematical Modelling and Numerical Analysis</w:t>
       </w:r>
       <w:r>
         <w:rPr>
@@ -3265,28 +3164,7 @@
           <w:szCs w:val="20"/>
           <w:lang w:eastAsia="zh-CN" w:bidi="zh-CN"/>
         </w:rPr>
-        <w:t>SIAM Journal o</w:t>
-      </w:r>
-      <w:r>
-        <w:rPr>
-          <w:rFonts w:hint="eastAsia"/>
-          <w:caps w:val="0"/>
-          <w:spacing w:val="-6"/>
-          <w:sz w:val="20"/>
-          <w:szCs w:val="20"/>
-          <w:lang w:eastAsia="zh-CN" w:bidi="zh-CN"/>
-        </w:rPr>
-        <w:t>n</w:t>
-      </w:r>
-      <w:r>
-        <w:rPr>
-          <w:caps w:val="0"/>
-          <w:spacing w:val="-6"/>
-          <w:sz w:val="20"/>
-          <w:szCs w:val="20"/>
-          <w:lang w:eastAsia="zh-CN" w:bidi="zh-CN"/>
-        </w:rPr>
-        <w:t xml:space="preserve"> Scientific Computing</w:t>
+        <w:t>Proceedings of The Royal Society, Series A</w:t>
       </w:r>
       <w:r>
         <w:rPr>
@@ -3308,10 +3186,11 @@
     </w:p>
     <w:p>
       <w:pPr>
-        <w:rPr>
-          <w:rFonts w:hint="eastAsia"/>
-          <w:sz w:val="10"/>
-          <w:szCs w:val="10"/>
+        <w:pStyle w:val="5"/>
+        <w:rPr>
+          <w:rFonts w:hint="eastAsia"/>
+          <w:sz w:val="20"/>
+          <w:szCs w:val="20"/>
           <w:lang w:bidi="zh-CN"/>
         </w:rPr>
       </w:pPr>
@@ -3327,9 +3206,11 @@
       <w:r>
         <w:rPr>
           <w:rFonts w:hint="eastAsia"/>
-          <w:sz w:val="20"/>
-          <w:szCs w:val="20"/>
-          <w:lang w:bidi="zh-CN"/>
+          <w:caps w:val="0"/>
+          <w:spacing w:val="-6"/>
+          <w:sz w:val="20"/>
+          <w:szCs w:val="20"/>
+          <w:lang w:eastAsia="zh-CN" w:bidi="zh-CN"/>
         </w:rPr>
         <w:t xml:space="preserve">T. </w:t>
       </w:r>
@@ -3337,9 +3218,11 @@
       <w:r>
         <w:rPr>
           <w:rFonts w:hint="eastAsia"/>
-          <w:sz w:val="20"/>
-          <w:szCs w:val="20"/>
-          <w:lang w:bidi="zh-CN"/>
+          <w:caps w:val="0"/>
+          <w:spacing w:val="-6"/>
+          <w:sz w:val="20"/>
+          <w:szCs w:val="20"/>
+          <w:lang w:eastAsia="zh-CN" w:bidi="zh-CN"/>
         </w:rPr>
         <w:t>Hu,</w:t>
       </w:r>
@@ -3347,66 +3230,142 @@
       <w:r>
         <w:rPr>
           <w:rFonts w:hint="eastAsia"/>
-          <w:sz w:val="20"/>
-          <w:szCs w:val="20"/>
-          <w:lang w:bidi="zh-CN"/>
+          <w:caps w:val="0"/>
+          <w:spacing w:val="-6"/>
+          <w:sz w:val="20"/>
+          <w:szCs w:val="20"/>
+          <w:lang w:eastAsia="zh-CN" w:bidi="zh-CN"/>
         </w:rPr>
         <w:t xml:space="preserve"> </w:t>
       </w:r>
       <w:r>
         <w:rPr>
-          <w:sz w:val="20"/>
-          <w:szCs w:val="20"/>
-          <w:lang w:bidi="zh-CN"/>
+          <w:caps w:val="0"/>
+          <w:spacing w:val="-6"/>
+          <w:sz w:val="20"/>
+          <w:szCs w:val="20"/>
+          <w:lang w:eastAsia="zh-CN" w:bidi="zh-CN"/>
         </w:rPr>
         <w:t>B. Jin,</w:t>
       </w:r>
       <w:r>
         <w:rPr>
           <w:rFonts w:hint="eastAsia"/>
-          <w:sz w:val="20"/>
-          <w:szCs w:val="20"/>
-          <w:lang w:bidi="zh-CN"/>
+          <w:caps w:val="0"/>
+          <w:spacing w:val="-6"/>
+          <w:sz w:val="20"/>
+          <w:szCs w:val="20"/>
+          <w:lang w:eastAsia="zh-CN" w:bidi="zh-CN"/>
+        </w:rPr>
+        <w:t xml:space="preserve"> F. Wang</w:t>
+      </w:r>
+      <w:r>
+        <w:rPr>
+          <w:rFonts w:hint="eastAsia"/>
+          <w:caps w:val="0"/>
+          <w:spacing w:val="-6"/>
+          <w:sz w:val="20"/>
+          <w:szCs w:val="20"/>
+          <w:lang w:eastAsia="zh-CN" w:bidi="zh-CN"/>
+        </w:rPr>
+        <w:t xml:space="preserve">, and </w:t>
+      </w:r>
+      <w:r>
+        <w:rPr>
+          <w:rFonts w:hint="eastAsia"/>
+          <w:caps w:val="0"/>
+          <w:spacing w:val="-6"/>
+          <w:sz w:val="20"/>
+          <w:szCs w:val="20"/>
+          <w:lang w:eastAsia="zh-CN" w:bidi="zh-CN"/>
+        </w:rPr>
+        <w:t xml:space="preserve">Y. Xu. </w:t>
+      </w:r>
+      <w:r>
+        <w:rPr>
+          <w:caps w:val="0"/>
+          <w:spacing w:val="-6"/>
+          <w:sz w:val="20"/>
+          <w:szCs w:val="20"/>
+          <w:lang w:eastAsia="zh-CN" w:bidi="zh-CN"/>
+        </w:rPr>
+        <w:t>A Hybrid Iterative Deep Ritz Method for Elliptic Interface Problems</w:t>
+      </w:r>
+      <w:r>
+        <w:rPr>
+          <w:rFonts w:hint="eastAsia"/>
+          <w:sz w:val="20"/>
+          <w:szCs w:val="20"/>
+          <w:lang w:bidi="zh-CN"/>
+        </w:rPr>
+        <w:t xml:space="preserve">, </w:t>
+      </w:r>
+      <w:r>
+        <w:rPr>
+          <w:rFonts w:hint="eastAsia"/>
+          <w:caps w:val="0"/>
+          <w:spacing w:val="-6"/>
+          <w:sz w:val="20"/>
+          <w:szCs w:val="20"/>
+          <w:lang w:eastAsia="zh-CN" w:bidi="zh-CN"/>
+        </w:rPr>
+        <w:t>arxiv.org</w:t>
+      </w:r>
+      <w:r>
+        <w:rPr>
+          <w:caps w:val="0"/>
+          <w:spacing w:val="-6"/>
+          <w:sz w:val="20"/>
+          <w:szCs w:val="20"/>
+          <w:lang w:eastAsia="zh-CN" w:bidi="zh-CN"/>
+        </w:rPr>
+        <w:t>: 2609.27325</w:t>
+      </w:r>
+      <w:r>
+        <w:rPr>
+          <w:rFonts w:hint="eastAsia"/>
+          <w:caps w:val="0"/>
+          <w:spacing w:val="-6"/>
+          <w:sz w:val="20"/>
+          <w:szCs w:val="20"/>
+          <w:lang w:eastAsia="zh-CN" w:bidi="zh-CN"/>
+        </w:rPr>
+        <w:t>,</w:t>
+      </w:r>
+      <w:r>
+        <w:rPr>
+          <w:caps w:val="0"/>
+          <w:spacing w:val="-6"/>
+          <w:sz w:val="20"/>
+          <w:szCs w:val="20"/>
+          <w:lang w:eastAsia="zh-CN" w:bidi="zh-CN"/>
         </w:rPr>
         <w:t xml:space="preserve"> </w:t>
       </w:r>
       <w:r>
         <w:rPr>
           <w:rFonts w:hint="eastAsia"/>
-          <w:sz w:val="20"/>
-          <w:szCs w:val="20"/>
-          <w:lang w:bidi="zh-CN"/>
-        </w:rPr>
-        <w:t>F. Wang</w:t>
-      </w:r>
-      <w:r>
-        <w:rPr>
-          <w:rFonts w:hint="eastAsia"/>
-          <w:sz w:val="20"/>
-          <w:szCs w:val="20"/>
-          <w:lang w:bidi="zh-CN"/>
-        </w:rPr>
-        <w:t xml:space="preserve"> and</w:t>
-      </w:r>
-      <w:r>
-        <w:rPr>
-          <w:rFonts w:hint="eastAsia"/>
-          <w:sz w:val="20"/>
-          <w:szCs w:val="20"/>
-          <w:lang w:bidi="zh-CN"/>
-        </w:rPr>
-        <w:t xml:space="preserve"> Y. Xu. </w:t>
-      </w:r>
-      <w:r>
-        <w:rPr>
-          <w:sz w:val="20"/>
-          <w:szCs w:val="20"/>
-          <w:lang w:bidi="zh-CN"/>
-        </w:rPr>
-        <w:t>A Hybrid Iterative Deep Ritz Method for Elliptic Interface Problems</w:t>
-      </w:r>
-      <w:r>
-        <w:rPr>
+          <w:caps w:val="0"/>
+          <w:spacing w:val="-6"/>
+          <w:sz w:val="20"/>
+          <w:szCs w:val="20"/>
+          <w:lang w:eastAsia="zh-CN" w:bidi="zh-CN"/>
+        </w:rPr>
+        <w:t xml:space="preserve">submitted to </w:t>
+      </w:r>
+      <w:r>
+        <w:rPr>
+          <w:caps w:val="0"/>
+          <w:spacing w:val="-6"/>
+          <w:sz w:val="20"/>
+          <w:szCs w:val="20"/>
+          <w:lang w:eastAsia="zh-CN" w:bidi="zh-CN"/>
+        </w:rPr>
+        <w:t>Computers and Mathematics with Applications</w:t>
+      </w:r>
+      <w:r>
+        <w:rPr>
+          <w:rFonts w:hint="eastAsia"/>
           <w:sz w:val="20"/>
           <w:szCs w:val="20"/>
           <w:lang w:bidi="zh-CN"/>
@@ -3415,43 +3374,25 @@
       </w:r>
       <w:r>
         <w:rPr>
-          <w:rFonts w:cstheme="majorBidi" w:hint="eastAsia"/>
-          <w:sz w:val="20"/>
-          <w:szCs w:val="20"/>
-          <w:lang w:bidi="zh-CN"/>
-        </w:rPr>
-        <w:t xml:space="preserve">submitted to </w:t>
-      </w:r>
-      <w:r>
-        <w:rPr>
-          <w:rFonts w:hint="eastAsia"/>
-          <w:sz w:val="20"/>
-          <w:szCs w:val="20"/>
-          <w:lang w:bidi="zh-CN"/>
-        </w:rPr>
-        <w:t>Journal of Computational Physics</w:t>
-      </w:r>
-      <w:r>
-        <w:rPr>
-          <w:rFonts w:hint="eastAsia"/>
-          <w:sz w:val="20"/>
-          <w:szCs w:val="20"/>
-          <w:lang w:bidi="zh-CN"/>
-        </w:rPr>
-        <w:t xml:space="preserve">, </w:t>
-      </w:r>
-      <w:r>
-        <w:rPr>
-          <w:sz w:val="20"/>
-          <w:szCs w:val="20"/>
-          <w:lang w:bidi="zh-CN"/>
-        </w:rPr>
-        <w:t>2026.</w:t>
+          <w:sz w:val="20"/>
+          <w:szCs w:val="20"/>
+          <w:lang w:bidi="zh-CN"/>
+        </w:rPr>
+        <w:t>2026</w:t>
+      </w:r>
+      <w:r>
+        <w:rPr>
+          <w:sz w:val="20"/>
+          <w:szCs w:val="20"/>
+          <w:lang w:bidi="zh-CN"/>
+        </w:rPr>
+        <w:t>.</w:t>
       </w:r>
     </w:p>
     <w:p>
       <w:pPr>
         <w:rPr>
+          <w:rFonts w:hint="eastAsia"/>
           <w:sz w:val="10"/>
           <w:szCs w:val="10"/>
           <w:lang w:bidi="zh-CN"/>
@@ -3487,6 +3428,7 @@
       <w:pPr>
         <w:pStyle w:val="5"/>
         <w:rPr>
+          <w:rFonts w:hint="eastAsia"/>
           <w:sz w:val="20"/>
           <w:szCs w:val="20"/>
           <w:lang w:bidi="zh-CN"/>
@@ -3657,6 +3599,7 @@
       <w:pPr>
         <w:pStyle w:val="5"/>
         <w:rPr>
+          <w:rFonts w:hint="eastAsia"/>
           <w:caps w:val="0"/>
           <w:spacing w:val="-6"/>
           <w:sz w:val="20"/>
@@ -4128,150 +4071,7 @@
           <w:szCs w:val="20"/>
           <w:lang w:eastAsia="zh-CN" w:bidi="zh-CN"/>
         </w:rPr>
-        <w:t xml:space="preserve"> from Linear Wave equations to Nonlinear wave equations</w:t>
-      </w:r>
-      <w:r>
-        <w:rPr>
-          <w:rFonts w:hint="eastAsia"/>
-          <w:caps w:val="0"/>
-          <w:spacing w:val="-6"/>
-          <w:sz w:val="20"/>
-          <w:szCs w:val="20"/>
-          <w:lang w:eastAsia="zh-CN" w:bidi="zh-CN"/>
-        </w:rPr>
-        <w:t>.</w:t>
-      </w:r>
-    </w:p>
-    <w:p>
-      <w:pPr>
-        <w:pStyle w:val="5"/>
-        <w:rPr>
-          <w:rFonts w:hint="eastAsia"/>
-          <w:caps w:val="0"/>
-          <w:spacing w:val="-6"/>
-          <w:sz w:val="20"/>
-          <w:szCs w:val="20"/>
-          <w:lang w:eastAsia="zh-CN" w:bidi="zh-CN"/>
-        </w:rPr>
-      </w:pPr>
-      <w:r>
-        <w:rPr>
-          <w:rFonts w:hint="eastAsia"/>
-          <w:sz w:val="20"/>
-          <w:szCs w:val="20"/>
-          <w:lang w:bidi="zh-CN"/>
-        </w:rPr>
-        <w:t>•</w:t>
-      </w:r>
-      <w:r>
-        <w:rPr>
-          <w:rFonts w:hint="eastAsia"/>
-          <w:caps w:val="0"/>
-          <w:spacing w:val="-6"/>
-          <w:sz w:val="20"/>
-          <w:szCs w:val="20"/>
-          <w:lang w:eastAsia="zh-CN" w:bidi="zh-CN"/>
-        </w:rPr>
-        <w:t>J</w:t>
-      </w:r>
-      <w:r>
-        <w:rPr>
-          <w:rFonts w:hint="eastAsia"/>
-          <w:caps w:val="0"/>
-          <w:spacing w:val="-6"/>
-          <w:sz w:val="20"/>
-          <w:szCs w:val="20"/>
-          <w:lang w:eastAsia="zh-CN" w:bidi="zh-CN"/>
-        </w:rPr>
-        <w:t xml:space="preserve">. </w:t>
-      </w:r>
-      <w:r>
-        <w:rPr>
-          <w:rFonts w:hint="eastAsia"/>
-          <w:caps w:val="0"/>
-          <w:spacing w:val="-6"/>
-          <w:sz w:val="20"/>
-          <w:szCs w:val="20"/>
-          <w:lang w:eastAsia="zh-CN" w:bidi="zh-CN"/>
-        </w:rPr>
-        <w:t xml:space="preserve">Han and T. </w:t>
-      </w:r>
-      <w:proofErr w:type="spellStart"/>
-      <w:r>
-        <w:rPr>
-          <w:rFonts w:hint="eastAsia"/>
-          <w:caps w:val="0"/>
-          <w:spacing w:val="-6"/>
-          <w:sz w:val="20"/>
-          <w:szCs w:val="20"/>
-          <w:lang w:eastAsia="zh-CN" w:bidi="zh-CN"/>
-        </w:rPr>
-        <w:t>Hu</w:t>
-      </w:r>
-      <w:r>
-        <w:rPr>
-          <w:caps w:val="0"/>
-          <w:spacing w:val="-6"/>
-          <w:sz w:val="20"/>
-          <w:szCs w:val="20"/>
-          <w:lang w:eastAsia="zh-CN" w:bidi="zh-CN"/>
-        </w:rPr>
-        <w:t>,</w:t>
-      </w:r>
-      <w:proofErr w:type="spellEnd"/>
-      <w:r>
-        <w:rPr>
-          <w:caps w:val="0"/>
-          <w:spacing w:val="-6"/>
-          <w:sz w:val="20"/>
-          <w:szCs w:val="20"/>
-          <w:lang w:eastAsia="zh-CN" w:bidi="zh-CN"/>
-        </w:rPr>
-        <w:t xml:space="preserve"> </w:t>
-      </w:r>
-      <w:r>
-        <w:rPr>
-          <w:rFonts w:hint="eastAsia"/>
-          <w:caps w:val="0"/>
-          <w:spacing w:val="-6"/>
-          <w:sz w:val="20"/>
-          <w:szCs w:val="20"/>
-          <w:lang w:eastAsia="zh-CN" w:bidi="zh-CN"/>
-        </w:rPr>
-        <w:t>Diffusion-Based Out-of-Distribution Detection for Active Learning</w:t>
-      </w:r>
-      <w:r>
-        <w:rPr>
-          <w:rFonts w:hint="eastAsia"/>
-          <w:caps w:val="0"/>
-          <w:spacing w:val="-6"/>
-          <w:sz w:val="20"/>
-          <w:szCs w:val="20"/>
-          <w:lang w:eastAsia="zh-CN" w:bidi="zh-CN"/>
-        </w:rPr>
-        <w:t xml:space="preserve"> </w:t>
-      </w:r>
-      <w:r>
-        <w:rPr>
-          <w:rFonts w:hint="eastAsia"/>
-          <w:caps w:val="0"/>
-          <w:spacing w:val="-6"/>
-          <w:sz w:val="20"/>
-          <w:szCs w:val="20"/>
-          <w:lang w:eastAsia="zh-CN" w:bidi="zh-CN"/>
-        </w:rPr>
-        <w:t>in Scientific Machine Learning</w:t>
-      </w:r>
-      <w:r>
-        <w:rPr>
-          <w:rFonts w:hint="eastAsia"/>
-          <w:caps w:val="0"/>
-          <w:spacing w:val="-6"/>
-          <w:sz w:val="20"/>
-          <w:szCs w:val="20"/>
-          <w:lang w:eastAsia="zh-CN" w:bidi="zh-CN"/>
-        </w:rPr>
-        <w:t>.</w:t>
+        <w:t xml:space="preserve"> from Linear Wave equations to Nonlinear wave equations.</w:t>
       </w:r>
     </w:p>
     <w:p>
@@ -7599,7 +7399,16 @@
           <w:szCs w:val="20"/>
           <w:lang w:eastAsia="zh-CN" w:bidi="zh-CN"/>
         </w:rPr>
-        <w:t>MA</w:t>
+        <w:t>M</w:t>
+      </w:r>
+      <w:r>
+        <w:rPr>
+          <w:rFonts w:hint="eastAsia"/>
+          <w:sz w:val="20"/>
+          <w:szCs w:val="20"/>
+          <w:lang w:eastAsia="zh-CN" w:bidi="zh-CN"/>
+        </w:rPr>
+        <w:t>M</w:t>
       </w:r>
       <w:r>
         <w:rPr>
@@ -7860,7 +7669,16 @@
           <w:szCs w:val="20"/>
           <w:lang w:eastAsia="zh-CN" w:bidi="zh-CN"/>
         </w:rPr>
-        <w:t>MA</w:t>
+        <w:t>M</w:t>
+      </w:r>
+      <w:r>
+        <w:rPr>
+          <w:rFonts w:hint="eastAsia"/>
+          <w:sz w:val="20"/>
+          <w:szCs w:val="20"/>
+          <w:lang w:eastAsia="zh-CN" w:bidi="zh-CN"/>
+        </w:rPr>
+        <w:t>M</w:t>
       </w:r>
       <w:r>
         <w:rPr>
@@ -9655,24 +9473,33 @@
     <w:rsid w:val="000734D9"/>
     <w:rsid w:val="000E1361"/>
     <w:rsid w:val="00100785"/>
+    <w:rsid w:val="00112428"/>
     <w:rsid w:val="00163A89"/>
     <w:rsid w:val="002703C3"/>
     <w:rsid w:val="00333797"/>
     <w:rsid w:val="00430BE3"/>
     <w:rsid w:val="00434E0D"/>
     <w:rsid w:val="004446AB"/>
+    <w:rsid w:val="004B2895"/>
+    <w:rsid w:val="004D574C"/>
     <w:rsid w:val="005D4B9F"/>
     <w:rsid w:val="005F6181"/>
+    <w:rsid w:val="00622559"/>
     <w:rsid w:val="007830A4"/>
     <w:rsid w:val="008B68B6"/>
     <w:rsid w:val="00964D40"/>
+    <w:rsid w:val="00971217"/>
+    <w:rsid w:val="00A479F1"/>
     <w:rsid w:val="00A556DD"/>
     <w:rsid w:val="00B67BFC"/>
     <w:rsid w:val="00C166A9"/>
     <w:rsid w:val="00C613B2"/>
     <w:rsid w:val="00C737BF"/>
+    <w:rsid w:val="00DB347B"/>
+    <w:rsid w:val="00E14D23"/>
     <w:rsid w:val="00E572AC"/>
     <w:rsid w:val="00E95B14"/>
+    <w:rsid w:val="00EF05ED"/>
     <w:rsid w:val="00F171E8"/>
     <w:rsid w:val="00FB32DA"/>
   </w:rsids>
@@ -10362,24 +10189,6 @@
 </file>
 
 <file path=customXml/item3.xml><?xml version="1.0" encoding="utf-8"?>
-<p:properties xmlns:p="http://schemas.microsoft.com/office/2006/metadata/properties" xmlns:xsi="http://www.w3.org/2001/XMLSchema-instance" xmlns:pc="http://schemas.microsoft.com/office/infopath/2007/PartnerControls">
-  <documentManagement>
-    <Status xmlns="71af3243-3dd4-4a8d-8c0d-dd76da1f02a5">Not started</Status>
-    <MediaServiceKeyPoints xmlns="71af3243-3dd4-4a8d-8c0d-dd76da1f02a5" xsi:nil="true"/>
-  </documentManagement>
-</p:properties>
-</file>
-
-<file path=customXml/item4.xml><?xml version="1.0" encoding="utf-8"?>
-<?mso-contentType ?>
-<FormTemplates xmlns="http://schemas.microsoft.com/sharepoint/v3/contenttype/forms">
-  <Display>DocumentLibraryForm</Display>
-  <Edit>DocumentLibraryForm</Edit>
-  <New>DocumentLibraryForm</New>
-</FormTemplates>
-</file>
-
-<file path=customXml/item5.xml><?xml version="1.0" encoding="utf-8"?>
 <ct:contentTypeSchema xmlns:ct="http://schemas.microsoft.com/office/2006/metadata/contentType" xmlns:ma="http://schemas.microsoft.com/office/2006/metadata/properties/metaAttributes" ct:_="" ma:_="" ma:contentTypeName="Document" ma:contentTypeID="0x01010079F111ED35F8CC479449609E8A0923A6" ma:contentTypeVersion="12" ma:contentTypeDescription="Create a new document." ma:contentTypeScope="" ma:versionID="7e3f163ba23981de9af4e94a4fc3c170">
   <xsd:schema xmlns:xsd="http://www.w3.org/2001/XMLSchema" xmlns:xs="http://www.w3.org/2001/XMLSchema" xmlns:p="http://schemas.microsoft.com/office/2006/metadata/properties" xmlns:ns2="71af3243-3dd4-4a8d-8c0d-dd76da1f02a5" xmlns:ns3="16c05727-aa75-4e4a-9b5f-8a80a1165891" targetNamespace="http://schemas.microsoft.com/office/2006/metadata/properties" ma:root="true" ma:fieldsID="77303e74caa42b09a8f0afd286949429" ns2:_="" ns3:_="">
     <xsd:import namespace="71af3243-3dd4-4a8d-8c0d-dd76da1f02a5"/>
@@ -10600,6 +10409,24 @@
 </ct:contentTypeSchema>
 </file>
 
+<file path=customXml/item4.xml><?xml version="1.0" encoding="utf-8"?>
+<?mso-contentType ?>
+<FormTemplates xmlns="http://schemas.microsoft.com/sharepoint/v3/contenttype/forms">
+  <Display>DocumentLibraryForm</Display>
+  <Edit>DocumentLibraryForm</Edit>
+  <New>DocumentLibraryForm</New>
+</FormTemplates>
+</file>
+
+<file path=customXml/item5.xml><?xml version="1.0" encoding="utf-8"?>
+<p:properties xmlns:p="http://schemas.microsoft.com/office/2006/metadata/properties" xmlns:xsi="http://www.w3.org/2001/XMLSchema-instance" xmlns:pc="http://schemas.microsoft.com/office/infopath/2007/PartnerControls">
+  <documentManagement>
+    <Status xmlns="71af3243-3dd4-4a8d-8c0d-dd76da1f02a5">Not started</Status>
+    <MediaServiceKeyPoints xmlns="71af3243-3dd4-4a8d-8c0d-dd76da1f02a5" xsi:nil="true"/>
+  </documentManagement>
+</p:properties>
+</file>
+
 <file path=customXml/itemProps1.xml><?xml version="1.0" encoding="utf-8"?>
 <ds:datastoreItem xmlns:ds="http://schemas.openxmlformats.org/officeDocument/2006/customXml" ds:itemID="{55AF091B-3C7A-41E3-B477-F2FDAA23CFDA}">
   <ds:schemaRefs>
@@ -10617,24 +10444,6 @@
 </file>
 
 <file path=customXml/itemProps3.xml><?xml version="1.0" encoding="utf-8"?>
-<ds:datastoreItem xmlns:ds="http://schemas.openxmlformats.org/officeDocument/2006/customXml" ds:itemID="{5E0FE642-8C86-4F8E-948D-DA548BE05CB4}">
-  <ds:schemaRefs>
-    <ds:schemaRef ds:uri="http://schemas.microsoft.com/office/2006/metadata/properties"/>
-    <ds:schemaRef ds:uri="http://schemas.microsoft.com/office/infopath/2007/PartnerControls"/>
-    <ds:schemaRef ds:uri="71af3243-3dd4-4a8d-8c0d-dd76da1f02a5"/>
-  </ds:schemaRefs>
-</ds:datastoreItem>
-</file>
-
-<file path=customXml/itemProps4.xml><?xml version="1.0" encoding="utf-8"?>
-<ds:datastoreItem xmlns:ds="http://schemas.openxmlformats.org/officeDocument/2006/customXml" ds:itemID="{A5F36DAD-1865-421F-B51D-0044A1B8F72E}">
-  <ds:schemaRefs>
-    <ds:schemaRef ds:uri="http://schemas.microsoft.com/sharepoint/v3/contenttype/forms"/>
-  </ds:schemaRefs>
-</ds:datastoreItem>
-</file>
-
-<file path=customXml/itemProps5.xml><?xml version="1.0" encoding="utf-8"?>
 <ds:datastoreItem xmlns:ds="http://schemas.openxmlformats.org/officeDocument/2006/customXml" ds:itemID="{625C7810-C14D-4C7F-BDE1-174B2A91A17D}">
   <ds:schemaRefs>
     <ds:schemaRef ds:uri="http://schemas.microsoft.com/office/2006/metadata/contentType"/>
@@ -10651,4 +10460,22 @@
     <ds:schemaRef ds:uri="http://schemas.microsoft.com/internal/obd"/>
   </ds:schemaRefs>
 </ds:datastoreItem>
+</file>
+
+<file path=customXml/itemProps4.xml><?xml version="1.0" encoding="utf-8"?>
+<ds:datastoreItem xmlns:ds="http://schemas.openxmlformats.org/officeDocument/2006/customXml" ds:itemID="{A5F36DAD-1865-421F-B51D-0044A1B8F72E}">
+  <ds:schemaRefs>
+    <ds:schemaRef ds:uri="http://schemas.microsoft.com/sharepoint/v3/contenttype/forms"/>
+  </ds:schemaRefs>
+</ds:datastoreItem>
+</file>
+
+<file path=customXml/itemProps5.xml><?xml version="1.0" encoding="utf-8"?>
+<ds:datastoreItem xmlns:ds="http://schemas.openxmlformats.org/officeDocument/2006/customXml" ds:itemID="{5E0FE642-8C86-4F8E-948D-DA548BE05CB4}">
+  <ds:schemaRefs>
+    <ds:schemaRef ds:uri="http://schemas.microsoft.com/office/2006/metadata/properties"/>
+    <ds:schemaRef ds:uri="http://schemas.microsoft.com/office/infopath/2007/PartnerControls"/>
+    <ds:schemaRef ds:uri="71af3243-3dd4-4a8d-8c0d-dd76da1f02a5"/>
+  </ds:schemaRefs>
+</ds:datastoreItem>
 </file>
</xml_diff>

<commit_message>
Deploying to gh-pages from @ hhjc-web/hhjc-web.github.io@4d23b7ae154f4f60ce786296db9cd77f4ca3af7d 🚀
</commit_message>
<xml_diff>
--- a/cv.docx
+++ b/cv.docx
@@ -138,29 +138,7 @@
                                   <w:szCs w:val="18"/>
                                   <w:lang w:bidi="zh-CN"/>
                                 </w:rPr>
-                                <w:t>https://hhj</w:t>
-                              </w:r>
-                              <w:r>
-                                <w:rPr>
-                                  <w:rStyle w:val="af0"/>
-                                  <w:b/>
-                                  <w:bCs/>
-                                  <w:sz w:val="18"/>
-                                  <w:szCs w:val="18"/>
-                                  <w:lang w:bidi="zh-CN"/>
-                                </w:rPr>
-                                <w:t>c</w:t>
-                              </w:r>
-                              <w:r>
-                                <w:rPr>
-                                  <w:rStyle w:val="af0"/>
-                                  <w:b/>
-                                  <w:bCs/>
-                                  <w:sz w:val="18"/>
-                                  <w:szCs w:val="18"/>
-                                  <w:lang w:bidi="zh-CN"/>
-                                </w:rPr>
-                                <w:t>-web.github.io/</w:t>
+                                <w:t>https://hhjc-web.github.io/</w:t>
                               </w:r>
                             </w:hyperlink>
                           </w:p>
@@ -211,29 +189,7 @@
                                   <w:szCs w:val="18"/>
                                   <w:lang w:bidi="zh-CN"/>
                                 </w:rPr>
-                                <w:t>https://scholar.google.com/citations?user=D7NWc1</w:t>
-                              </w:r>
-                              <w:r>
-                                <w:rPr>
-                                  <w:rStyle w:val="af0"/>
-                                  <w:b/>
-                                  <w:bCs/>
-                                  <w:sz w:val="18"/>
-                                  <w:szCs w:val="18"/>
-                                  <w:lang w:bidi="zh-CN"/>
-                                </w:rPr>
-                                <w:t>Q</w:t>
-                              </w:r>
-                              <w:r>
-                                <w:rPr>
-                                  <w:rStyle w:val="af0"/>
-                                  <w:b/>
-                                  <w:bCs/>
-                                  <w:sz w:val="18"/>
-                                  <w:szCs w:val="18"/>
-                                  <w:lang w:bidi="zh-CN"/>
-                                </w:rPr>
-                                <w:t>AAAAJ&amp;</w:t>
+                                <w:t>https://scholar.google.com/citations?user=D7NWc1QAAAAJ&amp;</w:t>
                               </w:r>
                             </w:hyperlink>
                           </w:p>
@@ -421,29 +377,7 @@
                             <w:szCs w:val="18"/>
                             <w:lang w:bidi="zh-CN"/>
                           </w:rPr>
-                          <w:t>https://hhj</w:t>
-                        </w:r>
-                        <w:r>
-                          <w:rPr>
-                            <w:rStyle w:val="af0"/>
-                            <w:b/>
-                            <w:bCs/>
-                            <w:sz w:val="18"/>
-                            <w:szCs w:val="18"/>
-                            <w:lang w:bidi="zh-CN"/>
-                          </w:rPr>
-                          <w:t>c</w:t>
-                        </w:r>
-                        <w:r>
-                          <w:rPr>
-                            <w:rStyle w:val="af0"/>
-                            <w:b/>
-                            <w:bCs/>
-                            <w:sz w:val="18"/>
-                            <w:szCs w:val="18"/>
-                            <w:lang w:bidi="zh-CN"/>
-                          </w:rPr>
-                          <w:t>-web.github.io/</w:t>
+                          <w:t>https://hhjc-web.github.io/</w:t>
                         </w:r>
                       </w:hyperlink>
                     </w:p>
@@ -494,29 +428,7 @@
                             <w:szCs w:val="18"/>
                             <w:lang w:bidi="zh-CN"/>
                           </w:rPr>
-                          <w:t>https://scholar.google.com/citations?user=D7NWc1</w:t>
-                        </w:r>
-                        <w:r>
-                          <w:rPr>
-                            <w:rStyle w:val="af0"/>
-                            <w:b/>
-                            <w:bCs/>
-                            <w:sz w:val="18"/>
-                            <w:szCs w:val="18"/>
-                            <w:lang w:bidi="zh-CN"/>
-                          </w:rPr>
-                          <w:t>Q</w:t>
-                        </w:r>
-                        <w:r>
-                          <w:rPr>
-                            <w:rStyle w:val="af0"/>
-                            <w:b/>
-                            <w:bCs/>
-                            <w:sz w:val="18"/>
-                            <w:szCs w:val="18"/>
-                            <w:lang w:bidi="zh-CN"/>
-                          </w:rPr>
-                          <w:t>AAAAJ&amp;</w:t>
+                          <w:t>https://scholar.google.com/citations?user=D7NWc1QAAAAJ&amp;</w:t>
                         </w:r>
                       </w:hyperlink>
                     </w:p>
@@ -2366,29 +2278,16 @@
         </w:rPr>
         <w:t xml:space="preserve"> B. Jin, and Z. Zhou, </w:t>
       </w:r>
-      <w:proofErr w:type="gramStart"/>
-      <w:r>
-        <w:rPr>
-          <w:rFonts w:hint="eastAsia"/>
-          <w:caps w:val="0"/>
-          <w:spacing w:val="-6"/>
-          <w:sz w:val="20"/>
-          <w:szCs w:val="20"/>
-          <w:lang w:eastAsia="zh-CN" w:bidi="zh-CN"/>
-        </w:rPr>
-        <w:t>Point</w:t>
-      </w:r>
-      <w:proofErr w:type="gramEnd"/>
-      <w:r>
-        <w:rPr>
-          <w:rFonts w:hint="eastAsia"/>
-          <w:caps w:val="0"/>
-          <w:spacing w:val="-6"/>
-          <w:sz w:val="20"/>
-          <w:szCs w:val="20"/>
-          <w:lang w:eastAsia="zh-CN" w:bidi="zh-CN"/>
-        </w:rPr>
-        <w:t xml:space="preserve"> </w:t>
+      <w:r>
+        <w:rPr>
+          <w:rFonts w:hint="eastAsia"/>
+          <w:caps w:val="0"/>
+          <w:spacing w:val="-6"/>
+          <w:sz w:val="20"/>
+          <w:szCs w:val="20"/>
+          <w:lang w:eastAsia="zh-CN" w:bidi="zh-CN"/>
+        </w:rPr>
+        <w:t xml:space="preserve">Point </w:t>
       </w:r>
       <w:r>
         <w:rPr>
@@ -3045,11 +2944,12 @@
       </w:r>
       <w:r>
         <w:rPr>
-          <w:sz w:val="20"/>
-          <w:szCs w:val="20"/>
-          <w:lang w:bidi="zh-CN"/>
-        </w:rPr>
-        <w:t>.</w:t>
+          <w:rFonts w:hint="eastAsia"/>
+          <w:sz w:val="20"/>
+          <w:szCs w:val="20"/>
+          <w:lang w:eastAsia="zh-CN" w:bidi="zh-CN"/>
+        </w:rPr>
+        <w:t>,</w:t>
       </w:r>
       <w:r>
         <w:rPr>
@@ -3094,14 +2994,13 @@
       </w:r>
       <w:r>
         <w:rPr>
-          <w:rFonts w:hint="eastAsia"/>
-          <w:caps w:val="0"/>
-          <w:spacing w:val="-6"/>
-          <w:sz w:val="20"/>
-          <w:szCs w:val="20"/>
-          <w:lang w:eastAsia="zh-CN" w:bidi="zh-CN"/>
-        </w:rPr>
-        <w:t>Journal of Computational Physics</w:t>
+          <w:caps w:val="0"/>
+          <w:spacing w:val="-6"/>
+          <w:sz w:val="20"/>
+          <w:szCs w:val="20"/>
+          <w:lang w:eastAsia="zh-CN" w:bidi="zh-CN"/>
+        </w:rPr>
+        <w:t>ESAIM: Mathematical Modelling and Numerical Analysis</w:t>
       </w:r>
       <w:r>
         <w:rPr>
@@ -3265,28 +3164,7 @@
           <w:szCs w:val="20"/>
           <w:lang w:eastAsia="zh-CN" w:bidi="zh-CN"/>
         </w:rPr>
-        <w:t>SIAM Journal o</w:t>
-      </w:r>
-      <w:r>
-        <w:rPr>
-          <w:rFonts w:hint="eastAsia"/>
-          <w:caps w:val="0"/>
-          <w:spacing w:val="-6"/>
-          <w:sz w:val="20"/>
-          <w:szCs w:val="20"/>
-          <w:lang w:eastAsia="zh-CN" w:bidi="zh-CN"/>
-        </w:rPr>
-        <w:t>n</w:t>
-      </w:r>
-      <w:r>
-        <w:rPr>
-          <w:caps w:val="0"/>
-          <w:spacing w:val="-6"/>
-          <w:sz w:val="20"/>
-          <w:szCs w:val="20"/>
-          <w:lang w:eastAsia="zh-CN" w:bidi="zh-CN"/>
-        </w:rPr>
-        <w:t xml:space="preserve"> Scientific Computing</w:t>
+        <w:t>Proceedings of The Royal Society, Series A</w:t>
       </w:r>
       <w:r>
         <w:rPr>
@@ -3308,10 +3186,11 @@
     </w:p>
     <w:p>
       <w:pPr>
-        <w:rPr>
-          <w:rFonts w:hint="eastAsia"/>
-          <w:sz w:val="10"/>
-          <w:szCs w:val="10"/>
+        <w:pStyle w:val="5"/>
+        <w:rPr>
+          <w:rFonts w:hint="eastAsia"/>
+          <w:sz w:val="20"/>
+          <w:szCs w:val="20"/>
           <w:lang w:bidi="zh-CN"/>
         </w:rPr>
       </w:pPr>
@@ -3327,9 +3206,11 @@
       <w:r>
         <w:rPr>
           <w:rFonts w:hint="eastAsia"/>
-          <w:sz w:val="20"/>
-          <w:szCs w:val="20"/>
-          <w:lang w:bidi="zh-CN"/>
+          <w:caps w:val="0"/>
+          <w:spacing w:val="-6"/>
+          <w:sz w:val="20"/>
+          <w:szCs w:val="20"/>
+          <w:lang w:eastAsia="zh-CN" w:bidi="zh-CN"/>
         </w:rPr>
         <w:t xml:space="preserve">T. </w:t>
       </w:r>
@@ -3337,9 +3218,11 @@
       <w:r>
         <w:rPr>
           <w:rFonts w:hint="eastAsia"/>
-          <w:sz w:val="20"/>
-          <w:szCs w:val="20"/>
-          <w:lang w:bidi="zh-CN"/>
+          <w:caps w:val="0"/>
+          <w:spacing w:val="-6"/>
+          <w:sz w:val="20"/>
+          <w:szCs w:val="20"/>
+          <w:lang w:eastAsia="zh-CN" w:bidi="zh-CN"/>
         </w:rPr>
         <w:t>Hu,</w:t>
       </w:r>
@@ -3347,66 +3230,142 @@
       <w:r>
         <w:rPr>
           <w:rFonts w:hint="eastAsia"/>
-          <w:sz w:val="20"/>
-          <w:szCs w:val="20"/>
-          <w:lang w:bidi="zh-CN"/>
+          <w:caps w:val="0"/>
+          <w:spacing w:val="-6"/>
+          <w:sz w:val="20"/>
+          <w:szCs w:val="20"/>
+          <w:lang w:eastAsia="zh-CN" w:bidi="zh-CN"/>
         </w:rPr>
         <w:t xml:space="preserve"> </w:t>
       </w:r>
       <w:r>
         <w:rPr>
-          <w:sz w:val="20"/>
-          <w:szCs w:val="20"/>
-          <w:lang w:bidi="zh-CN"/>
+          <w:caps w:val="0"/>
+          <w:spacing w:val="-6"/>
+          <w:sz w:val="20"/>
+          <w:szCs w:val="20"/>
+          <w:lang w:eastAsia="zh-CN" w:bidi="zh-CN"/>
         </w:rPr>
         <w:t>B. Jin,</w:t>
       </w:r>
       <w:r>
         <w:rPr>
           <w:rFonts w:hint="eastAsia"/>
-          <w:sz w:val="20"/>
-          <w:szCs w:val="20"/>
-          <w:lang w:bidi="zh-CN"/>
+          <w:caps w:val="0"/>
+          <w:spacing w:val="-6"/>
+          <w:sz w:val="20"/>
+          <w:szCs w:val="20"/>
+          <w:lang w:eastAsia="zh-CN" w:bidi="zh-CN"/>
+        </w:rPr>
+        <w:t xml:space="preserve"> F. Wang</w:t>
+      </w:r>
+      <w:r>
+        <w:rPr>
+          <w:rFonts w:hint="eastAsia"/>
+          <w:caps w:val="0"/>
+          <w:spacing w:val="-6"/>
+          <w:sz w:val="20"/>
+          <w:szCs w:val="20"/>
+          <w:lang w:eastAsia="zh-CN" w:bidi="zh-CN"/>
+        </w:rPr>
+        <w:t xml:space="preserve">, and </w:t>
+      </w:r>
+      <w:r>
+        <w:rPr>
+          <w:rFonts w:hint="eastAsia"/>
+          <w:caps w:val="0"/>
+          <w:spacing w:val="-6"/>
+          <w:sz w:val="20"/>
+          <w:szCs w:val="20"/>
+          <w:lang w:eastAsia="zh-CN" w:bidi="zh-CN"/>
+        </w:rPr>
+        <w:t xml:space="preserve">Y. Xu. </w:t>
+      </w:r>
+      <w:r>
+        <w:rPr>
+          <w:caps w:val="0"/>
+          <w:spacing w:val="-6"/>
+          <w:sz w:val="20"/>
+          <w:szCs w:val="20"/>
+          <w:lang w:eastAsia="zh-CN" w:bidi="zh-CN"/>
+        </w:rPr>
+        <w:t>A Hybrid Iterative Deep Ritz Method for Elliptic Interface Problems</w:t>
+      </w:r>
+      <w:r>
+        <w:rPr>
+          <w:rFonts w:hint="eastAsia"/>
+          <w:sz w:val="20"/>
+          <w:szCs w:val="20"/>
+          <w:lang w:bidi="zh-CN"/>
+        </w:rPr>
+        <w:t xml:space="preserve">, </w:t>
+      </w:r>
+      <w:r>
+        <w:rPr>
+          <w:rFonts w:hint="eastAsia"/>
+          <w:caps w:val="0"/>
+          <w:spacing w:val="-6"/>
+          <w:sz w:val="20"/>
+          <w:szCs w:val="20"/>
+          <w:lang w:eastAsia="zh-CN" w:bidi="zh-CN"/>
+        </w:rPr>
+        <w:t>arxiv.org</w:t>
+      </w:r>
+      <w:r>
+        <w:rPr>
+          <w:caps w:val="0"/>
+          <w:spacing w:val="-6"/>
+          <w:sz w:val="20"/>
+          <w:szCs w:val="20"/>
+          <w:lang w:eastAsia="zh-CN" w:bidi="zh-CN"/>
+        </w:rPr>
+        <w:t>: 2609.27325</w:t>
+      </w:r>
+      <w:r>
+        <w:rPr>
+          <w:rFonts w:hint="eastAsia"/>
+          <w:caps w:val="0"/>
+          <w:spacing w:val="-6"/>
+          <w:sz w:val="20"/>
+          <w:szCs w:val="20"/>
+          <w:lang w:eastAsia="zh-CN" w:bidi="zh-CN"/>
+        </w:rPr>
+        <w:t>,</w:t>
+      </w:r>
+      <w:r>
+        <w:rPr>
+          <w:caps w:val="0"/>
+          <w:spacing w:val="-6"/>
+          <w:sz w:val="20"/>
+          <w:szCs w:val="20"/>
+          <w:lang w:eastAsia="zh-CN" w:bidi="zh-CN"/>
         </w:rPr>
         <w:t xml:space="preserve"> </w:t>
       </w:r>
       <w:r>
         <w:rPr>
           <w:rFonts w:hint="eastAsia"/>
-          <w:sz w:val="20"/>
-          <w:szCs w:val="20"/>
-          <w:lang w:bidi="zh-CN"/>
-        </w:rPr>
-        <w:t>F. Wang</w:t>
-      </w:r>
-      <w:r>
-        <w:rPr>
-          <w:rFonts w:hint="eastAsia"/>
-          <w:sz w:val="20"/>
-          <w:szCs w:val="20"/>
-          <w:lang w:bidi="zh-CN"/>
-        </w:rPr>
-        <w:t xml:space="preserve"> and</w:t>
-      </w:r>
-      <w:r>
-        <w:rPr>
-          <w:rFonts w:hint="eastAsia"/>
-          <w:sz w:val="20"/>
-          <w:szCs w:val="20"/>
-          <w:lang w:bidi="zh-CN"/>
-        </w:rPr>
-        <w:t xml:space="preserve"> Y. Xu. </w:t>
-      </w:r>
-      <w:r>
-        <w:rPr>
-          <w:sz w:val="20"/>
-          <w:szCs w:val="20"/>
-          <w:lang w:bidi="zh-CN"/>
-        </w:rPr>
-        <w:t>A Hybrid Iterative Deep Ritz Method for Elliptic Interface Problems</w:t>
-      </w:r>
-      <w:r>
-        <w:rPr>
+          <w:caps w:val="0"/>
+          <w:spacing w:val="-6"/>
+          <w:sz w:val="20"/>
+          <w:szCs w:val="20"/>
+          <w:lang w:eastAsia="zh-CN" w:bidi="zh-CN"/>
+        </w:rPr>
+        <w:t xml:space="preserve">submitted to </w:t>
+      </w:r>
+      <w:r>
+        <w:rPr>
+          <w:caps w:val="0"/>
+          <w:spacing w:val="-6"/>
+          <w:sz w:val="20"/>
+          <w:szCs w:val="20"/>
+          <w:lang w:eastAsia="zh-CN" w:bidi="zh-CN"/>
+        </w:rPr>
+        <w:t>Computers and Mathematics with Applications</w:t>
+      </w:r>
+      <w:r>
+        <w:rPr>
+          <w:rFonts w:hint="eastAsia"/>
           <w:sz w:val="20"/>
           <w:szCs w:val="20"/>
           <w:lang w:bidi="zh-CN"/>
@@ -3415,43 +3374,25 @@
       </w:r>
       <w:r>
         <w:rPr>
-          <w:rFonts w:cstheme="majorBidi" w:hint="eastAsia"/>
-          <w:sz w:val="20"/>
-          <w:szCs w:val="20"/>
-          <w:lang w:bidi="zh-CN"/>
-        </w:rPr>
-        <w:t xml:space="preserve">submitted to </w:t>
-      </w:r>
-      <w:r>
-        <w:rPr>
-          <w:rFonts w:hint="eastAsia"/>
-          <w:sz w:val="20"/>
-          <w:szCs w:val="20"/>
-          <w:lang w:bidi="zh-CN"/>
-        </w:rPr>
-        <w:t>Journal of Computational Physics</w:t>
-      </w:r>
-      <w:r>
-        <w:rPr>
-          <w:rFonts w:hint="eastAsia"/>
-          <w:sz w:val="20"/>
-          <w:szCs w:val="20"/>
-          <w:lang w:bidi="zh-CN"/>
-        </w:rPr>
-        <w:t xml:space="preserve">, </w:t>
-      </w:r>
-      <w:r>
-        <w:rPr>
-          <w:sz w:val="20"/>
-          <w:szCs w:val="20"/>
-          <w:lang w:bidi="zh-CN"/>
-        </w:rPr>
-        <w:t>2026.</w:t>
+          <w:sz w:val="20"/>
+          <w:szCs w:val="20"/>
+          <w:lang w:bidi="zh-CN"/>
+        </w:rPr>
+        <w:t>2026</w:t>
+      </w:r>
+      <w:r>
+        <w:rPr>
+          <w:sz w:val="20"/>
+          <w:szCs w:val="20"/>
+          <w:lang w:bidi="zh-CN"/>
+        </w:rPr>
+        <w:t>.</w:t>
       </w:r>
     </w:p>
     <w:p>
       <w:pPr>
         <w:rPr>
+          <w:rFonts w:hint="eastAsia"/>
           <w:sz w:val="10"/>
           <w:szCs w:val="10"/>
           <w:lang w:bidi="zh-CN"/>
@@ -3487,6 +3428,7 @@
       <w:pPr>
         <w:pStyle w:val="5"/>
         <w:rPr>
+          <w:rFonts w:hint="eastAsia"/>
           <w:sz w:val="20"/>
           <w:szCs w:val="20"/>
           <w:lang w:bidi="zh-CN"/>
@@ -3657,6 +3599,7 @@
       <w:pPr>
         <w:pStyle w:val="5"/>
         <w:rPr>
+          <w:rFonts w:hint="eastAsia"/>
           <w:caps w:val="0"/>
           <w:spacing w:val="-6"/>
           <w:sz w:val="20"/>
@@ -4128,150 +4071,7 @@
           <w:szCs w:val="20"/>
           <w:lang w:eastAsia="zh-CN" w:bidi="zh-CN"/>
         </w:rPr>
-        <w:t xml:space="preserve"> from Linear Wave equations to Nonlinear wave equations</w:t>
-      </w:r>
-      <w:r>
-        <w:rPr>
-          <w:rFonts w:hint="eastAsia"/>
-          <w:caps w:val="0"/>
-          <w:spacing w:val="-6"/>
-          <w:sz w:val="20"/>
-          <w:szCs w:val="20"/>
-          <w:lang w:eastAsia="zh-CN" w:bidi="zh-CN"/>
-        </w:rPr>
-        <w:t>.</w:t>
-      </w:r>
-    </w:p>
-    <w:p>
-      <w:pPr>
-        <w:pStyle w:val="5"/>
-        <w:rPr>
-          <w:rFonts w:hint="eastAsia"/>
-          <w:caps w:val="0"/>
-          <w:spacing w:val="-6"/>
-          <w:sz w:val="20"/>
-          <w:szCs w:val="20"/>
-          <w:lang w:eastAsia="zh-CN" w:bidi="zh-CN"/>
-        </w:rPr>
-      </w:pPr>
-      <w:r>
-        <w:rPr>
-          <w:rFonts w:hint="eastAsia"/>
-          <w:sz w:val="20"/>
-          <w:szCs w:val="20"/>
-          <w:lang w:bidi="zh-CN"/>
-        </w:rPr>
-        <w:t>•</w:t>
-      </w:r>
-      <w:r>
-        <w:rPr>
-          <w:rFonts w:hint="eastAsia"/>
-          <w:caps w:val="0"/>
-          <w:spacing w:val="-6"/>
-          <w:sz w:val="20"/>
-          <w:szCs w:val="20"/>
-          <w:lang w:eastAsia="zh-CN" w:bidi="zh-CN"/>
-        </w:rPr>
-        <w:t>J</w:t>
-      </w:r>
-      <w:r>
-        <w:rPr>
-          <w:rFonts w:hint="eastAsia"/>
-          <w:caps w:val="0"/>
-          <w:spacing w:val="-6"/>
-          <w:sz w:val="20"/>
-          <w:szCs w:val="20"/>
-          <w:lang w:eastAsia="zh-CN" w:bidi="zh-CN"/>
-        </w:rPr>
-        <w:t xml:space="preserve">. </w:t>
-      </w:r>
-      <w:r>
-        <w:rPr>
-          <w:rFonts w:hint="eastAsia"/>
-          <w:caps w:val="0"/>
-          <w:spacing w:val="-6"/>
-          <w:sz w:val="20"/>
-          <w:szCs w:val="20"/>
-          <w:lang w:eastAsia="zh-CN" w:bidi="zh-CN"/>
-        </w:rPr>
-        <w:t xml:space="preserve">Han and T. </w:t>
-      </w:r>
-      <w:proofErr w:type="spellStart"/>
-      <w:r>
-        <w:rPr>
-          <w:rFonts w:hint="eastAsia"/>
-          <w:caps w:val="0"/>
-          <w:spacing w:val="-6"/>
-          <w:sz w:val="20"/>
-          <w:szCs w:val="20"/>
-          <w:lang w:eastAsia="zh-CN" w:bidi="zh-CN"/>
-        </w:rPr>
-        <w:t>Hu</w:t>
-      </w:r>
-      <w:r>
-        <w:rPr>
-          <w:caps w:val="0"/>
-          <w:spacing w:val="-6"/>
-          <w:sz w:val="20"/>
-          <w:szCs w:val="20"/>
-          <w:lang w:eastAsia="zh-CN" w:bidi="zh-CN"/>
-        </w:rPr>
-        <w:t>,</w:t>
-      </w:r>
-      <w:proofErr w:type="spellEnd"/>
-      <w:r>
-        <w:rPr>
-          <w:caps w:val="0"/>
-          <w:spacing w:val="-6"/>
-          <w:sz w:val="20"/>
-          <w:szCs w:val="20"/>
-          <w:lang w:eastAsia="zh-CN" w:bidi="zh-CN"/>
-        </w:rPr>
-        <w:t xml:space="preserve"> </w:t>
-      </w:r>
-      <w:r>
-        <w:rPr>
-          <w:rFonts w:hint="eastAsia"/>
-          <w:caps w:val="0"/>
-          <w:spacing w:val="-6"/>
-          <w:sz w:val="20"/>
-          <w:szCs w:val="20"/>
-          <w:lang w:eastAsia="zh-CN" w:bidi="zh-CN"/>
-        </w:rPr>
-        <w:t>Diffusion-Based Out-of-Distribution Detection for Active Learning</w:t>
-      </w:r>
-      <w:r>
-        <w:rPr>
-          <w:rFonts w:hint="eastAsia"/>
-          <w:caps w:val="0"/>
-          <w:spacing w:val="-6"/>
-          <w:sz w:val="20"/>
-          <w:szCs w:val="20"/>
-          <w:lang w:eastAsia="zh-CN" w:bidi="zh-CN"/>
-        </w:rPr>
-        <w:t xml:space="preserve"> </w:t>
-      </w:r>
-      <w:r>
-        <w:rPr>
-          <w:rFonts w:hint="eastAsia"/>
-          <w:caps w:val="0"/>
-          <w:spacing w:val="-6"/>
-          <w:sz w:val="20"/>
-          <w:szCs w:val="20"/>
-          <w:lang w:eastAsia="zh-CN" w:bidi="zh-CN"/>
-        </w:rPr>
-        <w:t>in Scientific Machine Learning</w:t>
-      </w:r>
-      <w:r>
-        <w:rPr>
-          <w:rFonts w:hint="eastAsia"/>
-          <w:caps w:val="0"/>
-          <w:spacing w:val="-6"/>
-          <w:sz w:val="20"/>
-          <w:szCs w:val="20"/>
-          <w:lang w:eastAsia="zh-CN" w:bidi="zh-CN"/>
-        </w:rPr>
-        <w:t>.</w:t>
+        <w:t xml:space="preserve"> from Linear Wave equations to Nonlinear wave equations.</w:t>
       </w:r>
     </w:p>
     <w:p>
@@ -7599,7 +7399,16 @@
           <w:szCs w:val="20"/>
           <w:lang w:eastAsia="zh-CN" w:bidi="zh-CN"/>
         </w:rPr>
-        <w:t>MA</w:t>
+        <w:t>M</w:t>
+      </w:r>
+      <w:r>
+        <w:rPr>
+          <w:rFonts w:hint="eastAsia"/>
+          <w:sz w:val="20"/>
+          <w:szCs w:val="20"/>
+          <w:lang w:eastAsia="zh-CN" w:bidi="zh-CN"/>
+        </w:rPr>
+        <w:t>M</w:t>
       </w:r>
       <w:r>
         <w:rPr>
@@ -7860,7 +7669,16 @@
           <w:szCs w:val="20"/>
           <w:lang w:eastAsia="zh-CN" w:bidi="zh-CN"/>
         </w:rPr>
-        <w:t>MA</w:t>
+        <w:t>M</w:t>
+      </w:r>
+      <w:r>
+        <w:rPr>
+          <w:rFonts w:hint="eastAsia"/>
+          <w:sz w:val="20"/>
+          <w:szCs w:val="20"/>
+          <w:lang w:eastAsia="zh-CN" w:bidi="zh-CN"/>
+        </w:rPr>
+        <w:t>M</w:t>
       </w:r>
       <w:r>
         <w:rPr>
@@ -9655,24 +9473,33 @@
     <w:rsid w:val="000734D9"/>
     <w:rsid w:val="000E1361"/>
     <w:rsid w:val="00100785"/>
+    <w:rsid w:val="00112428"/>
     <w:rsid w:val="00163A89"/>
     <w:rsid w:val="002703C3"/>
     <w:rsid w:val="00333797"/>
     <w:rsid w:val="00430BE3"/>
     <w:rsid w:val="00434E0D"/>
     <w:rsid w:val="004446AB"/>
+    <w:rsid w:val="004B2895"/>
+    <w:rsid w:val="004D574C"/>
     <w:rsid w:val="005D4B9F"/>
     <w:rsid w:val="005F6181"/>
+    <w:rsid w:val="00622559"/>
     <w:rsid w:val="007830A4"/>
     <w:rsid w:val="008B68B6"/>
     <w:rsid w:val="00964D40"/>
+    <w:rsid w:val="00971217"/>
+    <w:rsid w:val="00A479F1"/>
     <w:rsid w:val="00A556DD"/>
     <w:rsid w:val="00B67BFC"/>
     <w:rsid w:val="00C166A9"/>
     <w:rsid w:val="00C613B2"/>
     <w:rsid w:val="00C737BF"/>
+    <w:rsid w:val="00DB347B"/>
+    <w:rsid w:val="00E14D23"/>
     <w:rsid w:val="00E572AC"/>
     <w:rsid w:val="00E95B14"/>
+    <w:rsid w:val="00EF05ED"/>
     <w:rsid w:val="00F171E8"/>
     <w:rsid w:val="00FB32DA"/>
   </w:rsids>
@@ -10362,24 +10189,6 @@
 </file>
 
 <file path=customXml/item3.xml><?xml version="1.0" encoding="utf-8"?>
-<p:properties xmlns:p="http://schemas.microsoft.com/office/2006/metadata/properties" xmlns:xsi="http://www.w3.org/2001/XMLSchema-instance" xmlns:pc="http://schemas.microsoft.com/office/infopath/2007/PartnerControls">
-  <documentManagement>
-    <Status xmlns="71af3243-3dd4-4a8d-8c0d-dd76da1f02a5">Not started</Status>
-    <MediaServiceKeyPoints xmlns="71af3243-3dd4-4a8d-8c0d-dd76da1f02a5" xsi:nil="true"/>
-  </documentManagement>
-</p:properties>
-</file>
-
-<file path=customXml/item4.xml><?xml version="1.0" encoding="utf-8"?>
-<?mso-contentType ?>
-<FormTemplates xmlns="http://schemas.microsoft.com/sharepoint/v3/contenttype/forms">
-  <Display>DocumentLibraryForm</Display>
-  <Edit>DocumentLibraryForm</Edit>
-  <New>DocumentLibraryForm</New>
-</FormTemplates>
-</file>
-
-<file path=customXml/item5.xml><?xml version="1.0" encoding="utf-8"?>
 <ct:contentTypeSchema xmlns:ct="http://schemas.microsoft.com/office/2006/metadata/contentType" xmlns:ma="http://schemas.microsoft.com/office/2006/metadata/properties/metaAttributes" ct:_="" ma:_="" ma:contentTypeName="Document" ma:contentTypeID="0x01010079F111ED35F8CC479449609E8A0923A6" ma:contentTypeVersion="12" ma:contentTypeDescription="Create a new document." ma:contentTypeScope="" ma:versionID="7e3f163ba23981de9af4e94a4fc3c170">
   <xsd:schema xmlns:xsd="http://www.w3.org/2001/XMLSchema" xmlns:xs="http://www.w3.org/2001/XMLSchema" xmlns:p="http://schemas.microsoft.com/office/2006/metadata/properties" xmlns:ns2="71af3243-3dd4-4a8d-8c0d-dd76da1f02a5" xmlns:ns3="16c05727-aa75-4e4a-9b5f-8a80a1165891" targetNamespace="http://schemas.microsoft.com/office/2006/metadata/properties" ma:root="true" ma:fieldsID="77303e74caa42b09a8f0afd286949429" ns2:_="" ns3:_="">
     <xsd:import namespace="71af3243-3dd4-4a8d-8c0d-dd76da1f02a5"/>
@@ -10600,6 +10409,24 @@
 </ct:contentTypeSchema>
 </file>
 
+<file path=customXml/item4.xml><?xml version="1.0" encoding="utf-8"?>
+<?mso-contentType ?>
+<FormTemplates xmlns="http://schemas.microsoft.com/sharepoint/v3/contenttype/forms">
+  <Display>DocumentLibraryForm</Display>
+  <Edit>DocumentLibraryForm</Edit>
+  <New>DocumentLibraryForm</New>
+</FormTemplates>
+</file>
+
+<file path=customXml/item5.xml><?xml version="1.0" encoding="utf-8"?>
+<p:properties xmlns:p="http://schemas.microsoft.com/office/2006/metadata/properties" xmlns:xsi="http://www.w3.org/2001/XMLSchema-instance" xmlns:pc="http://schemas.microsoft.com/office/infopath/2007/PartnerControls">
+  <documentManagement>
+    <Status xmlns="71af3243-3dd4-4a8d-8c0d-dd76da1f02a5">Not started</Status>
+    <MediaServiceKeyPoints xmlns="71af3243-3dd4-4a8d-8c0d-dd76da1f02a5" xsi:nil="true"/>
+  </documentManagement>
+</p:properties>
+</file>
+
 <file path=customXml/itemProps1.xml><?xml version="1.0" encoding="utf-8"?>
 <ds:datastoreItem xmlns:ds="http://schemas.openxmlformats.org/officeDocument/2006/customXml" ds:itemID="{55AF091B-3C7A-41E3-B477-F2FDAA23CFDA}">
   <ds:schemaRefs>
@@ -10617,24 +10444,6 @@
 </file>
 
 <file path=customXml/itemProps3.xml><?xml version="1.0" encoding="utf-8"?>
-<ds:datastoreItem xmlns:ds="http://schemas.openxmlformats.org/officeDocument/2006/customXml" ds:itemID="{5E0FE642-8C86-4F8E-948D-DA548BE05CB4}">
-  <ds:schemaRefs>
-    <ds:schemaRef ds:uri="http://schemas.microsoft.com/office/2006/metadata/properties"/>
-    <ds:schemaRef ds:uri="http://schemas.microsoft.com/office/infopath/2007/PartnerControls"/>
-    <ds:schemaRef ds:uri="71af3243-3dd4-4a8d-8c0d-dd76da1f02a5"/>
-  </ds:schemaRefs>
-</ds:datastoreItem>
-</file>
-
-<file path=customXml/itemProps4.xml><?xml version="1.0" encoding="utf-8"?>
-<ds:datastoreItem xmlns:ds="http://schemas.openxmlformats.org/officeDocument/2006/customXml" ds:itemID="{A5F36DAD-1865-421F-B51D-0044A1B8F72E}">
-  <ds:schemaRefs>
-    <ds:schemaRef ds:uri="http://schemas.microsoft.com/sharepoint/v3/contenttype/forms"/>
-  </ds:schemaRefs>
-</ds:datastoreItem>
-</file>
-
-<file path=customXml/itemProps5.xml><?xml version="1.0" encoding="utf-8"?>
 <ds:datastoreItem xmlns:ds="http://schemas.openxmlformats.org/officeDocument/2006/customXml" ds:itemID="{625C7810-C14D-4C7F-BDE1-174B2A91A17D}">
   <ds:schemaRefs>
     <ds:schemaRef ds:uri="http://schemas.microsoft.com/office/2006/metadata/contentType"/>
@@ -10651,4 +10460,22 @@
     <ds:schemaRef ds:uri="http://schemas.microsoft.com/internal/obd"/>
   </ds:schemaRefs>
 </ds:datastoreItem>
+</file>
+
+<file path=customXml/itemProps4.xml><?xml version="1.0" encoding="utf-8"?>
+<ds:datastoreItem xmlns:ds="http://schemas.openxmlformats.org/officeDocument/2006/customXml" ds:itemID="{A5F36DAD-1865-421F-B51D-0044A1B8F72E}">
+  <ds:schemaRefs>
+    <ds:schemaRef ds:uri="http://schemas.microsoft.com/sharepoint/v3/contenttype/forms"/>
+  </ds:schemaRefs>
+</ds:datastoreItem>
+</file>
+
+<file path=customXml/itemProps5.xml><?xml version="1.0" encoding="utf-8"?>
+<ds:datastoreItem xmlns:ds="http://schemas.openxmlformats.org/officeDocument/2006/customXml" ds:itemID="{5E0FE642-8C86-4F8E-948D-DA548BE05CB4}">
+  <ds:schemaRefs>
+    <ds:schemaRef ds:uri="http://schemas.microsoft.com/office/2006/metadata/properties"/>
+    <ds:schemaRef ds:uri="http://schemas.microsoft.com/office/infopath/2007/PartnerControls"/>
+    <ds:schemaRef ds:uri="71af3243-3dd4-4a8d-8c0d-dd76da1f02a5"/>
+  </ds:schemaRefs>
+</ds:datastoreItem>
 </file>
</xml_diff>